<commit_message>
Improving wording in documentation
</commit_message>
<xml_diff>
--- a/D7_OPTIMALISATION/SAMEN/M8.docx
+++ b/D7_OPTIMALISATION/SAMEN/M8.docx
@@ -3619,77 +3619,6 @@
     </w:p>
     <w:p>
       <w:pPr>
-        <w:pStyle w:val="Heading3"/>
-      </w:pPr>
-      <w:r>
-        <w:t xml:space="preserve">4. Bulk-loads en "stille" </w:t>
-      </w:r>
-      <w:proofErr w:type="spellStart"/>
-      <w:r>
-        <w:t>staleness</w:t>
-      </w:r>
-      <w:proofErr w:type="spellEnd"/>
-    </w:p>
-    <w:p>
-      <w:r>
-        <w:t xml:space="preserve">Een vierde, subtieler negatief gevolg ontdekte ik bij het opnieuw vullen van de database. Bulk-load procedures (PKG_S2_festivals.generateRandomPerformances met FORALL INSERT) </w:t>
-      </w:r>
-      <w:proofErr w:type="spellStart"/>
-      <w:r>
-        <w:t>commiten</w:t>
-      </w:r>
-      <w:proofErr w:type="spellEnd"/>
-      <w:r>
-        <w:t xml:space="preserve"> niet tussentijds; bij de uiteindelijke </w:t>
-      </w:r>
-      <w:proofErr w:type="spellStart"/>
-      <w:r>
-        <w:t>commit</w:t>
-      </w:r>
-      <w:proofErr w:type="spellEnd"/>
-      <w:r>
-        <w:t xml:space="preserve"> moet ON COMMIT alle 93 200 log-entries in één keer toepassen. Op Oracle </w:t>
-      </w:r>
-      <w:proofErr w:type="spellStart"/>
-      <w:r>
-        <w:t>Autonomous</w:t>
-      </w:r>
-      <w:proofErr w:type="spellEnd"/>
-      <w:r>
-        <w:t xml:space="preserve"> DB werd dit soms NIET volledig afgehandeld: de rijen zaten wel in Performance, de MV-log had 93 200 entries, maar de MV bleef op het oude aggregaat staan terwijl </w:t>
-      </w:r>
-      <w:proofErr w:type="spellStart"/>
-      <w:r>
-        <w:t>staleness</w:t>
-      </w:r>
-      <w:proofErr w:type="spellEnd"/>
-      <w:r>
-        <w:t xml:space="preserve"> onterecht FRESH rapporteerde.</w:t>
-      </w:r>
-    </w:p>
-    <w:p>
-      <w:r>
-        <w:t>Mitigatie: na bulk loads expliciet DBMS_MVIEW.REFRESH(</w:t>
-      </w:r>
-      <w:proofErr w:type="spellStart"/>
-      <w:r>
-        <w:t>method</w:t>
-      </w:r>
-      <w:proofErr w:type="spellEnd"/>
-      <w:r>
-        <w:t xml:space="preserve"> =&gt; 'F') aanroepen als </w:t>
-      </w:r>
-      <w:proofErr w:type="spellStart"/>
-      <w:r>
-        <w:t>safety</w:t>
-      </w:r>
-      <w:proofErr w:type="spellEnd"/>
-      <w:r>
-        <w:t xml:space="preserve"> net. Voor normale, kleinere transacties werkt ON COMMIT zonder problemen.</w:t>
-      </w:r>
-    </w:p>
-    <w:p>
-      <w:pPr>
         <w:pStyle w:val="Heading2"/>
       </w:pPr>
       <w:r>
@@ -3882,124 +3811,124 @@
         <w:pStyle w:val="Heading2"/>
       </w:pPr>
       <w:r>
+        <w:t>Conclusie</w:t>
+      </w:r>
+    </w:p>
+    <w:p>
+      <w:r>
+        <w:t xml:space="preserve">De </w:t>
+      </w:r>
+      <w:proofErr w:type="spellStart"/>
+      <w:r>
+        <w:t>materialized</w:t>
+      </w:r>
+      <w:proofErr w:type="spellEnd"/>
+      <w:r>
+        <w:t xml:space="preserve"> view met REFRESH FAST ON COMMIT en ENABLE QUERY REWRITE levert voor het festival-</w:t>
+      </w:r>
+      <w:proofErr w:type="spellStart"/>
+      <w:r>
+        <w:t>programming</w:t>
+      </w:r>
+      <w:proofErr w:type="spellEnd"/>
+      <w:r>
+        <w:t xml:space="preserve">-dashboard een dramatische verbetering: de </w:t>
+      </w:r>
+      <w:proofErr w:type="spellStart"/>
+      <w:r>
+        <w:t>optimizer</w:t>
+      </w:r>
+      <w:proofErr w:type="spellEnd"/>
+      <w:r>
+        <w:t xml:space="preserve">-kost daalt van 2860 naar 2 (~1430× goedkoper), de </w:t>
+      </w:r>
+      <w:proofErr w:type="spellStart"/>
+      <w:r>
+        <w:t>cold</w:t>
+      </w:r>
+      <w:proofErr w:type="spellEnd"/>
+      <w:r>
+        <w:t xml:space="preserve">-cache uitvoeringstijd van 550 ms naar 87 ms (~6× sneller), en query </w:t>
+      </w:r>
+      <w:proofErr w:type="spellStart"/>
+      <w:r>
+        <w:t>rewrite</w:t>
+      </w:r>
+      <w:proofErr w:type="spellEnd"/>
+      <w:r>
+        <w:t xml:space="preserve"> zorgt dat dit volledig transparant gebeurt</w:t>
+      </w:r>
+      <w:r>
+        <w:t>,</w:t>
+      </w:r>
+      <w:r>
+        <w:t xml:space="preserve"> geen applicatiecode hoeft te veranderen.</w:t>
+      </w:r>
+    </w:p>
+    <w:p>
+      <w:r>
+        <w:t xml:space="preserve">De prijs voor deze leessnelheid is een trager </w:t>
+      </w:r>
+      <w:proofErr w:type="spellStart"/>
+      <w:r>
+        <w:t>schrijfpad</w:t>
+      </w:r>
+      <w:proofErr w:type="spellEnd"/>
+      <w:r>
+        <w:t xml:space="preserve">: </w:t>
+      </w:r>
+      <w:proofErr w:type="spellStart"/>
+      <w:r>
+        <w:t>inserts</w:t>
+      </w:r>
+      <w:proofErr w:type="spellEnd"/>
+      <w:r>
+        <w:t xml:space="preserve"> op Performance worden ~2.7× trager omdat elke </w:t>
+      </w:r>
+      <w:proofErr w:type="spellStart"/>
+      <w:r>
+        <w:t>commit</w:t>
+      </w:r>
+      <w:proofErr w:type="spellEnd"/>
+      <w:r>
+        <w:t xml:space="preserve"> ook een incrementele MV-</w:t>
+      </w:r>
+      <w:proofErr w:type="spellStart"/>
+      <w:r>
+        <w:t>refresh</w:t>
+      </w:r>
+      <w:proofErr w:type="spellEnd"/>
+      <w:r>
+        <w:t xml:space="preserve"> moet uitvoeren. Voor </w:t>
+      </w:r>
+      <w:proofErr w:type="spellStart"/>
+      <w:r>
+        <w:t>read</w:t>
+      </w:r>
+      <w:proofErr w:type="spellEnd"/>
+      <w:r>
+        <w:t xml:space="preserve">-heavy </w:t>
+      </w:r>
+      <w:proofErr w:type="spellStart"/>
+      <w:r>
+        <w:t>workloads</w:t>
+      </w:r>
+      <w:proofErr w:type="spellEnd"/>
+      <w:r>
+        <w:t xml:space="preserve"> (zoals een dashboard) is dat een acceptabele </w:t>
+      </w:r>
+      <w:proofErr w:type="spellStart"/>
+      <w:r>
+        <w:t>trade</w:t>
+      </w:r>
+      <w:proofErr w:type="spellEnd"/>
+      <w:r>
+        <w:t>-off.</w:t>
+      </w:r>
+    </w:p>
+    <w:p>
+      <w:r>
         <w:lastRenderedPageBreak/>
-        <w:t>Conclusie</w:t>
-      </w:r>
-    </w:p>
-    <w:p>
-      <w:r>
-        <w:t xml:space="preserve">De </w:t>
-      </w:r>
-      <w:proofErr w:type="spellStart"/>
-      <w:r>
-        <w:t>materialized</w:t>
-      </w:r>
-      <w:proofErr w:type="spellEnd"/>
-      <w:r>
-        <w:t xml:space="preserve"> view met REFRESH FAST ON COMMIT en ENABLE QUERY REWRITE levert voor het festival-</w:t>
-      </w:r>
-      <w:proofErr w:type="spellStart"/>
-      <w:r>
-        <w:t>programming</w:t>
-      </w:r>
-      <w:proofErr w:type="spellEnd"/>
-      <w:r>
-        <w:t xml:space="preserve">-dashboard een dramatische verbetering: de </w:t>
-      </w:r>
-      <w:proofErr w:type="spellStart"/>
-      <w:r>
-        <w:t>optimizer</w:t>
-      </w:r>
-      <w:proofErr w:type="spellEnd"/>
-      <w:r>
-        <w:t xml:space="preserve">-kost daalt van 2860 naar 2 (~1430× goedkoper), de </w:t>
-      </w:r>
-      <w:proofErr w:type="spellStart"/>
-      <w:r>
-        <w:t>cold</w:t>
-      </w:r>
-      <w:proofErr w:type="spellEnd"/>
-      <w:r>
-        <w:t xml:space="preserve">-cache uitvoeringstijd van 550 ms naar 87 ms (~6× sneller), en query </w:t>
-      </w:r>
-      <w:proofErr w:type="spellStart"/>
-      <w:r>
-        <w:t>rewrite</w:t>
-      </w:r>
-      <w:proofErr w:type="spellEnd"/>
-      <w:r>
-        <w:t xml:space="preserve"> zorgt dat dit volledig transparant gebeurt</w:t>
-      </w:r>
-      <w:r>
-        <w:t>,</w:t>
-      </w:r>
-      <w:r>
-        <w:t xml:space="preserve"> geen applicatiecode hoeft te veranderen.</w:t>
-      </w:r>
-    </w:p>
-    <w:p>
-      <w:r>
-        <w:t xml:space="preserve">De prijs voor deze leessnelheid is een trager </w:t>
-      </w:r>
-      <w:proofErr w:type="spellStart"/>
-      <w:r>
-        <w:t>schrijfpad</w:t>
-      </w:r>
-      <w:proofErr w:type="spellEnd"/>
-      <w:r>
-        <w:t xml:space="preserve">: </w:t>
-      </w:r>
-      <w:proofErr w:type="spellStart"/>
-      <w:r>
-        <w:t>inserts</w:t>
-      </w:r>
-      <w:proofErr w:type="spellEnd"/>
-      <w:r>
-        <w:t xml:space="preserve"> op Performance worden ~2.7× trager omdat elke </w:t>
-      </w:r>
-      <w:proofErr w:type="spellStart"/>
-      <w:r>
-        <w:t>commit</w:t>
-      </w:r>
-      <w:proofErr w:type="spellEnd"/>
-      <w:r>
-        <w:t xml:space="preserve"> ook een incrementele MV-</w:t>
-      </w:r>
-      <w:proofErr w:type="spellStart"/>
-      <w:r>
-        <w:t>refresh</w:t>
-      </w:r>
-      <w:proofErr w:type="spellEnd"/>
-      <w:r>
-        <w:t xml:space="preserve"> moet uitvoeren. Voor </w:t>
-      </w:r>
-      <w:proofErr w:type="spellStart"/>
-      <w:r>
-        <w:t>read</w:t>
-      </w:r>
-      <w:proofErr w:type="spellEnd"/>
-      <w:r>
-        <w:t xml:space="preserve">-heavy </w:t>
-      </w:r>
-      <w:proofErr w:type="spellStart"/>
-      <w:r>
-        <w:t>workloads</w:t>
-      </w:r>
-      <w:proofErr w:type="spellEnd"/>
-      <w:r>
-        <w:t xml:space="preserve"> (zoals een dashboard) is dat een acceptabele </w:t>
-      </w:r>
-      <w:proofErr w:type="spellStart"/>
-      <w:r>
-        <w:t>trade</w:t>
-      </w:r>
-      <w:proofErr w:type="spellEnd"/>
-      <w:r>
-        <w:t>-off.</w:t>
-      </w:r>
-    </w:p>
-    <w:p>
-      <w:r>
         <w:t xml:space="preserve">Het </w:t>
       </w:r>
       <w:proofErr w:type="spellStart"/>

</xml_diff>